<commit_message>
Regenerate report and slide artifacts
</commit_message>
<xml_diff>
--- a/docs/makalah-knight-chaos-cipher.docx
+++ b/docs/makalah-knight-chaos-cipher.docx
@@ -107,7 +107,7 @@
         <w:pStyle w:val="FirstParagraph"/>
       </w:pPr>
       <w:r>
-        <w:t xml:space="preserve">Kriptografi merupakan salah satu komponen utama dalam keamanan siber karena digunakan untuk menjaga kerahasiaan, integritas, dan autentikasi data. Algoritma modern menggunakan prinsip substitusi dan permutasi berulang untuk mengubah plaintext menjadi ciphertext yang sulit dianalisis. Pada tugas ini dirancang sebuah algoritma kriptografi baru dengan nama</w:t>
+        <w:t xml:space="preserve">Kriptografi digunakan untuk menjaga kerahasiaan, integritas, dan autentikasi data. Algoritma cipher modern umumnya bekerja dengan prinsip substitution dan permutation yang diulang beberapa kali (round) untuk mengubah plaintext menjadi ciphertext. Pada tugas ini, saya merancang algoritma kriptografi baru bernama</w:t>
       </w:r>
       <w:r>
         <w:t xml:space="preserve"> </w:t>
@@ -128,7 +128,7 @@
         <w:pStyle w:val="BodyText"/>
       </w:pPr>
       <w:r>
-        <w:t xml:space="preserve">Rancangan KCC-128 menampilkan kreativitas pada modifikasi komponen utama cipher. Pembeda utama KCC-128 adalah penggunaan</w:t>
+        <w:t xml:space="preserve">Ide utama KCC-128 adalah memodifikasi komponen inti cipher dengan cara yang berbeda dari biasanya. Alih-alih menggunakan S-Box tetap seperti AES, saya menggunakan</w:t>
       </w:r>
       <w:r>
         <w:t xml:space="preserve"> </w:t>
@@ -138,10 +138,13 @@
           <w:b/>
           <w:bCs/>
         </w:rPr>
-        <w:t xml:space="preserve">logika permainan catur</w:t>
-      </w:r>
-      <w:r>
-        <w:t xml:space="preserve">, khususnya langkah kuda, sebagai mekanisme permutasi internal, serta penggunaan</w:t>
+        <w:t xml:space="preserve">logistic chaotic map</w:t>
+      </w:r>
+      <w:r>
+        <w:t xml:space="preserve"> </w:t>
+      </w:r>
+      <w:r>
+        <w:t xml:space="preserve">untuk men-generate S-Box yang berubah setiap round. Untuk bagian permutation, alih-alih ShiftRows yang linear, saya menggunakan pola</w:t>
       </w:r>
       <w:r>
         <w:t xml:space="preserve"> </w:t>
@@ -151,13 +154,13 @@
           <w:b/>
           <w:bCs/>
         </w:rPr>
-        <w:t xml:space="preserve">logistic chaotic map</w:t>
-      </w:r>
-      <w:r>
-        <w:t xml:space="preserve"> </w:t>
-      </w:r>
-      <w:r>
-        <w:t xml:space="preserve">sebagai pembentuk S-Box dinamis. Modifikasi diterapkan pada arsitektur substitusi, permutasi, difusi, dan key schedule.</w:t>
+        <w:t xml:space="preserve">langkah kuda catur</w:t>
+      </w:r>
+      <w:r>
+        <w:t xml:space="preserve"> </w:t>
+      </w:r>
+      <w:r>
+        <w:t xml:space="preserve">pada board 4×4 sebagai mekanisme shuffling posisi byte.</w:t>
       </w:r>
     </w:p>
     <w:bookmarkEnd w:id="9"/>
@@ -175,7 +178,7 @@
         <w:pStyle w:val="FirstParagraph"/>
       </w:pPr>
       <w:r>
-        <w:t xml:space="preserve">KCC-128 bekerja sebagai block cipher dengan ukuran blok 128 bit atau 16 byte. Setiap blok dipandang sebagai matriks 4x4. Algoritma menggunakan 10 round, dan setiap round memiliki material kunci yang berbeda. Material tersebut terdiri dari round key, S-Box dinamis, inverse S-Box, jalur permutasi langkah kuda, inverse permutation, dan pola rotasi bit.</w:t>
+        <w:t xml:space="preserve">KCC-128 bekerja sebagai block cipher dengan block size 128 bit (16 byte). Setiap block diperlakukan sebagai matrix 4×4. Algoritma berjalan selama 10 round, dimana setiap round menggunakan key material yang berbeda: round key, dynamic S-Box, inverse S-Box, knight permutation path, inverse permutation, dan rotation pattern.</w:t>
       </w:r>
     </w:p>
     <w:p>
@@ -183,7 +186,7 @@
         <w:pStyle w:val="BodyText"/>
       </w:pPr>
       <w:r>
-        <w:t xml:space="preserve">Kunci pengguna diproses dengan SHA-256 untuk menghasilkan master seed. Master seed ini kemudian digunakan untuk membentuk round material. Key schedule menghasilkan byte untuk operasi XOR sekaligus memengaruhi bentuk internal cipher, yaitu S-Box, rute permutasi, rotasi bit, dan difusi byte. Hal ini membuat struktur transformasi bergantung pada kunci.</w:t>
+        <w:t xml:space="preserve">Key dari user diproses dengan SHA-256 untuk menghasilkan master seed. Dari master seed ini, semua round material di-derive. Yang menarik adalah key schedule tidak hanya menghasilkan round key untuk XOR, tapi juga menentukan bentuk S-Box, route permutation, dan jumlah bit rotation. Jadi, key benar-benar mengubah seluruh struktur transformasi — bukan hanya nilai XOR-nya.</w:t>
       </w:r>
     </w:p>
     <w:bookmarkEnd w:id="10"/>
@@ -210,7 +213,7 @@
         <w:pStyle w:val="FirstParagraph"/>
       </w:pPr>
       <w:r>
-        <w:t xml:space="preserve">S-Box pada KCC-128 tidak bersifat tetap. Setiap round menghasilkan S-Box berbeda dengan menggunakan logistic chaotic map:</w:t>
+        <w:t xml:space="preserve">S-Box pada KCC-128 tidak tetap. Setiap round punya S-Box sendiri yang di-generate menggunakan logistic chaotic map:</w:t>
       </w:r>
     </w:p>
     <w:p>
@@ -229,7 +232,7 @@
         <w:pStyle w:val="FirstParagraph"/>
       </w:pPr>
       <w:r>
-        <w:t xml:space="preserve">Nilai awal</w:t>
+        <w:t xml:space="preserve">Initial value</w:t>
       </w:r>
       <w:r>
         <w:t xml:space="preserve"> </w:t>
@@ -259,7 +262,7 @@
         <w:t xml:space="preserve"> </w:t>
       </w:r>
       <w:r>
-        <w:t xml:space="preserve">diturunkan dari round seed. Deret chaotic yang dihasilkan digunakan untuk memberi skor pada nilai byte 0 sampai 255, kemudian byte diurutkan berdasarkan skor tersebut. Hasil akhirnya adalah permutasi 0..255 yang dapat digunakan sebagai S-Box. Karena S-Box adalah permutasi, inverse S-Box dapat dibuat untuk kebutuhan dekripsi.</w:t>
+        <w:t xml:space="preserve">di-derive dari round seed. Deret chaotic ini dipakai untuk memberi score pada setiap byte value 0–255, kemudian byte di-sort berdasarkan score tersebut. Hasilnya adalah permutation 0..255 yang berfungsi sebagai S-Box. Karena S-Box berupa permutation (bijective), inverse-nya bisa langsung dihitung untuk decryption.</w:t>
       </w:r>
     </w:p>
     <w:bookmarkEnd w:id="11"/>
@@ -277,7 +280,7 @@
         <w:pStyle w:val="FirstParagraph"/>
       </w:pPr>
       <w:r>
-        <w:t xml:space="preserve">Setiap blok 16 byte dipetakan ke papan 4x4. Posisi byte kemudian dipermutasi mengikuti pola langkah kuda catur. Titik awal ditentukan oleh round seed. Jika terdapat lebih dari satu langkah valid, algoritma memilih langkah dengan prinsip jumlah langkah lanjutan terkecil, lalu menggunakan round seed untuk memecahkan tie. Mekanisme ini mengintegrasikan logika game secara langsung ke komponen permutasi cipher.</w:t>
+        <w:t xml:space="preserve">Setiap block 16 byte di-map ke board 4×4. Posisi byte lalu di-permute mengikuti pola langkah kuda catur (L-shape: 2+1 cell). Starting position ditentukan oleh round seed. Kalau ada lebih dari satu valid move, dipilih yang punya jumlah onward move terkecil (Warnsdorff’s heuristic). Kalau masih tie, round seed dipakai sebagai tiebreaker.</w:t>
       </w:r>
     </w:p>
     <w:p>
@@ -285,7 +288,7 @@
         <w:pStyle w:val="BodyText"/>
       </w:pPr>
       <w:r>
-        <w:t xml:space="preserve">Berbeda dari pergeseran linear, langkah kuda menghasilkan perpindahan tidak berurutan antara baris dan kolom. Hal ini membantu menyebarkan posisi byte plaintext ke posisi ciphertext yang lebih sulit ditebak.</w:t>
+        <w:t xml:space="preserve">Dibanding shift linear seperti ShiftRows di AES, knight move menghasilkan perpindahan yang non-sequential antar row dan column. Byte yang tadinya adjacent bisa ter-scatter jauh setelah permutation.</w:t>
       </w:r>
     </w:p>
     <w:bookmarkEnd w:id="12"/>
@@ -303,17 +306,25 @@
         <w:pStyle w:val="FirstParagraph"/>
       </w:pPr>
       <w:r>
-        <w:t xml:space="preserve">Setelah substitusi dan permutasi, setiap byte dirotasi berdasarkan nilai round key. Kemudian dilakukan byte diffusion dan Feistel-like mixing. Lapisan ini penting karena substitusi dan permutasi saja belum cukup kuat untuk menyebarkan perubahan bit. Byte diffusion membuat satu byte memengaruhi byte lain, sedangkan Feistel-like mixing menjaga proses tetap invertibel sehingga dekripsi dapat dilakukan dengan benar.</w:t>
+        <w:t xml:space="preserve">Setelah substitution dan permutation, setiap byte di-rotate left sejumlah bit (jumlahnya ditentukan round key). Lalu dilakukan byte diffusion: setiap byte di-XOR dengan byte sebelumnya secara chaining. Terakhir ada Feistel-like mixing yang mencampur byte secara pair-wise dalam 3 pass.</w:t>
+      </w:r>
+    </w:p>
+    <w:p>
+      <w:pPr>
+        <w:pStyle w:val="BodyText"/>
+      </w:pPr>
+      <w:r>
+        <w:t xml:space="preserve">Kenapa perlu layer ini? Substitution mengacak value byte, permutation mengacak posisi byte, tapi keduanya belum menyebarkan perubahan antar byte. Diffusion dan Feistel mixing memastikan kalau satu byte berubah, efeknya propagate ke byte-byte lain.</w:t>
       </w:r>
     </w:p>
     <w:bookmarkEnd w:id="13"/>
-    <w:bookmarkStart w:id="14" w:name="mode-chaining"/>
+    <w:bookmarkStart w:id="14" w:name="mode-chaining-cbc"/>
     <w:p>
       <w:pPr>
         <w:pStyle w:val="Heading3"/>
       </w:pPr>
       <w:r>
-        <w:t xml:space="preserve">3.4 Mode Chaining</w:t>
+        <w:t xml:space="preserve">3.4 Mode Chaining (CBC)</w:t>
       </w:r>
     </w:p>
     <w:p>
@@ -321,18 +332,18 @@
         <w:pStyle w:val="FirstParagraph"/>
       </w:pPr>
       <w:r>
-        <w:t xml:space="preserve">Untuk pesan yang lebih panjang dari satu blok, KCC-128 menggunakan chaining internal. Blok plaintext pertama di-XOR dengan IV yang diturunkan dari kunci, sedangkan blok berikutnya di-XOR dengan ciphertext blok sebelumnya. Tujuannya adalah mencegah blok plaintext yang sama menghasilkan pola ciphertext yang sama pada posisi berbeda.</w:t>
+        <w:t xml:space="preserve">Untuk message yang lebih panjang dari 16 byte, KCC-128 menggunakan mode CBC (Cipher Block Chaining). Block pertama di-XOR dengan IV yang di-derive dari key, block kedua dan seterusnya di-XOR dengan ciphertext block sebelumnya. Tujuannya agar block plaintext yang sama di posisi berbeda tidak menghasilkan ciphertext yang sama.</w:t>
       </w:r>
     </w:p>
     <w:bookmarkEnd w:id="14"/>
     <w:bookmarkEnd w:id="15"/>
-    <w:bookmarkStart w:id="16" w:name="proses-enkripsi-dan-dekripsi"/>
+    <w:bookmarkStart w:id="16" w:name="proses-encryption-dan-decryption"/>
     <w:p>
       <w:pPr>
         <w:pStyle w:val="Heading2"/>
       </w:pPr>
       <w:r>
-        <w:t xml:space="preserve">4. Proses Enkripsi dan Dekripsi</w:t>
+        <w:t xml:space="preserve">4. Proses Encryption dan Decryption</w:t>
       </w:r>
     </w:p>
     <w:p>
@@ -340,95 +351,147 @@
         <w:pStyle w:val="FirstParagraph"/>
       </w:pPr>
       <w:r>
-        <w:t xml:space="preserve">Pada proses enkripsi, plaintext diberi padding PKCS#7 agar panjangnya kelipatan 16 byte. Setiap blok kemudian melewati 10 round. Urutan transformasi pada setiap round adalah</w:t>
-      </w:r>
-      <w:r>
-        <w:t xml:space="preserve"> </w:t>
-      </w:r>
-      <w:r>
-        <w:rPr>
-          <w:rStyle w:val="VerbatimChar"/>
+        <w:t xml:space="preserve">Pada encryption, plaintext diberi PKCS#7 padding supaya panjangnya menjadi multiple of 16 byte. Setiap block melewati 10 round dengan urutan:</w:t>
+      </w:r>
+    </w:p>
+    <w:p>
+      <w:pPr>
+        <w:pStyle w:val="Compact"/>
+        <w:numPr>
+          <w:ilvl w:val="0"/>
+          <w:numId w:val="1001"/>
+        </w:numPr>
+      </w:pPr>
+      <w:r>
+        <w:rPr>
+          <w:b/>
+          <w:bCs/>
         </w:rPr>
         <w:t xml:space="preserve">AddRoundKey</w:t>
       </w:r>
       <w:r>
-        <w:t xml:space="preserve">,</w:t>
-      </w:r>
-      <w:r>
-        <w:t xml:space="preserve"> </w:t>
-      </w:r>
-      <w:r>
-        <w:rPr>
-          <w:rStyle w:val="VerbatimChar"/>
+        <w:t xml:space="preserve"> </w:t>
+      </w:r>
+      <w:r>
+        <w:t xml:space="preserve">— state di-XOR dengan round key</w:t>
+      </w:r>
+    </w:p>
+    <w:p>
+      <w:pPr>
+        <w:pStyle w:val="Compact"/>
+        <w:numPr>
+          <w:ilvl w:val="0"/>
+          <w:numId w:val="1001"/>
+        </w:numPr>
+      </w:pPr>
+      <w:r>
+        <w:rPr>
+          <w:b/>
+          <w:bCs/>
         </w:rPr>
         <w:t xml:space="preserve">ChaoticSubBytes</w:t>
       </w:r>
       <w:r>
-        <w:t xml:space="preserve">,</w:t>
-      </w:r>
-      <w:r>
-        <w:t xml:space="preserve"> </w:t>
-      </w:r>
-      <w:r>
-        <w:rPr>
-          <w:rStyle w:val="VerbatimChar"/>
+        <w:t xml:space="preserve"> </w:t>
+      </w:r>
+      <w:r>
+        <w:t xml:space="preserve">— setiap byte di-substitute pakai dynamic S-Box</w:t>
+      </w:r>
+    </w:p>
+    <w:p>
+      <w:pPr>
+        <w:pStyle w:val="Compact"/>
+        <w:numPr>
+          <w:ilvl w:val="0"/>
+          <w:numId w:val="1001"/>
+        </w:numPr>
+      </w:pPr>
+      <w:r>
+        <w:rPr>
+          <w:b/>
+          <w:bCs/>
         </w:rPr>
         <w:t xml:space="preserve">KnightPermutation</w:t>
       </w:r>
       <w:r>
-        <w:t xml:space="preserve">,</w:t>
-      </w:r>
-      <w:r>
-        <w:t xml:space="preserve"> </w:t>
-      </w:r>
-      <w:r>
-        <w:rPr>
-          <w:rStyle w:val="VerbatimChar"/>
+        <w:t xml:space="preserve"> </w:t>
+      </w:r>
+      <w:r>
+        <w:t xml:space="preserve">— posisi byte di-shuffle pakai knight path</w:t>
+      </w:r>
+    </w:p>
+    <w:p>
+      <w:pPr>
+        <w:pStyle w:val="Compact"/>
+        <w:numPr>
+          <w:ilvl w:val="0"/>
+          <w:numId w:val="1001"/>
+        </w:numPr>
+      </w:pPr>
+      <w:r>
+        <w:rPr>
+          <w:b/>
+          <w:bCs/>
         </w:rPr>
         <w:t xml:space="preserve">BitShiftMix</w:t>
       </w:r>
       <w:r>
-        <w:t xml:space="preserve">,</w:t>
-      </w:r>
-      <w:r>
-        <w:t xml:space="preserve"> </w:t>
-      </w:r>
-      <w:r>
-        <w:rPr>
-          <w:rStyle w:val="VerbatimChar"/>
+        <w:t xml:space="preserve"> </w:t>
+      </w:r>
+      <w:r>
+        <w:t xml:space="preserve">— bit di dalam setiap byte di-rotate</w:t>
+      </w:r>
+    </w:p>
+    <w:p>
+      <w:pPr>
+        <w:pStyle w:val="Compact"/>
+        <w:numPr>
+          <w:ilvl w:val="0"/>
+          <w:numId w:val="1001"/>
+        </w:numPr>
+      </w:pPr>
+      <w:r>
+        <w:rPr>
+          <w:b/>
+          <w:bCs/>
         </w:rPr>
         <w:t xml:space="preserve">ByteDiffusion</w:t>
       </w:r>
       <w:r>
-        <w:t xml:space="preserve">, dan</w:t>
-      </w:r>
-      <w:r>
-        <w:t xml:space="preserve"> </w:t>
-      </w:r>
-      <w:r>
-        <w:rPr>
-          <w:rStyle w:val="VerbatimChar"/>
+        <w:t xml:space="preserve"> </w:t>
+      </w:r>
+      <w:r>
+        <w:t xml:space="preserve">— XOR chaining antar byte</w:t>
+      </w:r>
+    </w:p>
+    <w:p>
+      <w:pPr>
+        <w:pStyle w:val="Compact"/>
+        <w:numPr>
+          <w:ilvl w:val="0"/>
+          <w:numId w:val="1001"/>
+        </w:numPr>
+      </w:pPr>
+      <w:r>
+        <w:rPr>
+          <w:b/>
+          <w:bCs/>
         </w:rPr>
         <w:t xml:space="preserve">FeistelMix</w:t>
       </w:r>
       <w:r>
-        <w:t xml:space="preserve">.</w:t>
-      </w:r>
-    </w:p>
-    <w:p>
-      <w:pPr>
-        <w:pStyle w:val="BodyText"/>
-      </w:pPr>
-      <w:r>
-        <w:t xml:space="preserve">Proses dekripsi menjalankan inverse dari seluruh transformasi dalam urutan terbalik. Karena S-Box, permutasi, rotasi bit, byte diffusion, dan Feistel-like mixing semuanya dirancang invertibel, ciphertext dapat dikembalikan menjadi plaintext tanpa korupsi.</w:t>
-      </w:r>
-    </w:p>
-    <w:p>
-      <w:pPr>
-        <w:pStyle w:val="BodyText"/>
-      </w:pPr>
-      <w:r>
-        <w:t xml:space="preserve">Secara ringkas, rancangan komponen KCC-128 dapat dilihat pada tabel berikut.</w:t>
+        <w:t xml:space="preserve"> </w:t>
+      </w:r>
+      <w:r>
+        <w:t xml:space="preserve">— pair-wise mixing 3 pass</w:t>
+      </w:r>
+    </w:p>
+    <w:p>
+      <w:pPr>
+        <w:pStyle w:val="FirstParagraph"/>
+      </w:pPr>
+      <w:r>
+        <w:t xml:space="preserve">Pada decryption, semua step di-reverse dan menggunakan inverse operation. S-Box punya inverse S-Box, permutation punya inverse permutation, rotate left dibalik dengan rotate right, dan seterusnya. Karena semua operation dirancang invertible, plaintext bisa di-recover dengan tepat.</w:t>
       </w:r>
     </w:p>
     <w:tbl>
@@ -476,7 +539,7 @@
               <w:pStyle w:val="Compact"/>
             </w:pPr>
             <w:r>
-              <w:t xml:space="preserve">Sumber Keunikan</w:t>
+              <w:t xml:space="preserve">Keunikan</w:t>
             </w:r>
           </w:p>
         </w:tc>
@@ -500,7 +563,7 @@
               <w:pStyle w:val="Compact"/>
             </w:pPr>
             <w:r>
-              <w:t xml:space="preserve">Mencampur state dengan round key</w:t>
+              <w:t xml:space="preserve">XOR state dengan round key</w:t>
             </w:r>
           </w:p>
         </w:tc>
@@ -511,7 +574,7 @@
               <w:pStyle w:val="Compact"/>
             </w:pPr>
             <w:r>
-              <w:t xml:space="preserve">Round key diturunkan dari SHA-256 kunci pengguna</w:t>
+              <w:t xml:space="preserve">Round key dari SHA-256</w:t>
             </w:r>
           </w:p>
         </w:tc>
@@ -535,7 +598,7 @@
               <w:pStyle w:val="Compact"/>
             </w:pPr>
             <w:r>
-              <w:t xml:space="preserve">Mengganti nilai byte</w:t>
+              <w:t xml:space="preserve">Substitute value byte</w:t>
             </w:r>
           </w:p>
         </w:tc>
@@ -546,7 +609,7 @@
               <w:pStyle w:val="Compact"/>
             </w:pPr>
             <w:r>
-              <w:t xml:space="preserve">S-Box berubah per round dari logistic map</w:t>
+              <w:t xml:space="preserve">S-Box berubah tiap round (chaotic map)</w:t>
             </w:r>
           </w:p>
         </w:tc>
@@ -570,7 +633,7 @@
               <w:pStyle w:val="Compact"/>
             </w:pPr>
             <w:r>
-              <w:t xml:space="preserve">Menukar posisi byte</w:t>
+              <w:t xml:space="preserve">Shuffle posisi byte</w:t>
             </w:r>
           </w:p>
         </w:tc>
@@ -581,7 +644,7 @@
               <w:pStyle w:val="Compact"/>
             </w:pPr>
             <w:r>
-              <w:t xml:space="preserve">Jalur langkah kuda catur pada papan 4x4</w:t>
+              <w:t xml:space="preserve">Knight’s tour pattern pada board 4×4</w:t>
             </w:r>
           </w:p>
         </w:tc>
@@ -605,7 +668,7 @@
               <w:pStyle w:val="Compact"/>
             </w:pPr>
             <w:r>
-              <w:t xml:space="preserve">Memutar bit dalam byte</w:t>
+              <w:t xml:space="preserve">Rotate bit dalam byte</w:t>
             </w:r>
           </w:p>
         </w:tc>
@@ -616,7 +679,7 @@
               <w:pStyle w:val="Compact"/>
             </w:pPr>
             <w:r>
-              <w:t xml:space="preserve">Jumlah rotasi ditentukan round seed</w:t>
+              <w:t xml:space="preserve">Rotation amount dari round seed</w:t>
             </w:r>
           </w:p>
         </w:tc>
@@ -640,7 +703,7 @@
               <w:pStyle w:val="Compact"/>
             </w:pPr>
             <w:r>
-              <w:t xml:space="preserve">Menyebarkan pengaruh antarbyte</w:t>
+              <w:t xml:space="preserve">Propagate perubahan antar byte</w:t>
             </w:r>
           </w:p>
         </w:tc>
@@ -651,7 +714,7 @@
               <w:pStyle w:val="Compact"/>
             </w:pPr>
             <w:r>
-              <w:t xml:space="preserve">Setiap byte dipengaruhi carry dan tetangga</w:t>
+              <w:t xml:space="preserve">XOR chaining dengan carry</w:t>
             </w:r>
           </w:p>
         </w:tc>
@@ -675,7 +738,7 @@
               <w:pStyle w:val="Compact"/>
             </w:pPr>
             <w:r>
-              <w:t xml:space="preserve">Memperkuat avalanche effect</w:t>
+              <w:t xml:space="preserve">Strengthen diffusion</w:t>
             </w:r>
           </w:p>
         </w:tc>
@@ -686,7 +749,7 @@
               <w:pStyle w:val="Compact"/>
             </w:pPr>
             <w:r>
-              <w:t xml:space="preserve">Mixing invertibel sehingga dekripsi tetap mungkin</w:t>
+              <w:t xml:space="preserve">Invertible mixing 3 pass</w:t>
             </w:r>
           </w:p>
         </w:tc>
@@ -697,7 +760,7 @@
         <w:pStyle w:val="BodyText"/>
       </w:pPr>
       <w:r>
-        <w:t xml:space="preserve">Pseudocode inti enkripsi satu blok adalah sebagai berikut.</w:t>
+        <w:t xml:space="preserve">Pseudocode encryption satu block:</w:t>
       </w:r>
     </w:p>
     <w:p>
@@ -717,7 +780,7 @@
         <w:rPr>
           <w:rStyle w:val="VerbatimChar"/>
         </w:rPr>
-        <w:t xml:space="preserve">FOR each round material DO</w:t>
+        <w:t xml:space="preserve">FOR each round DO</w:t>
       </w:r>
       <w:r>
         <w:br/>
@@ -790,14 +853,6 @@
           <w:rStyle w:val="VerbatimChar"/>
         </w:rPr>
         <w:t xml:space="preserve">RETURN state</w:t>
-      </w:r>
-    </w:p>
-    <w:p>
-      <w:pPr>
-        <w:pStyle w:val="FirstParagraph"/>
-      </w:pPr>
-      <w:r>
-        <w:t xml:space="preserve">Pada dekripsi, urutan tersebut dibalik sepenuhnya. Bagian ini penting karena algoritma kriptografi tidak cukup hanya menghasilkan ciphertext acak; algoritma juga harus mampu mengembalikan data asli secara deterministik ketika kunci yang sama digunakan.</w:t>
       </w:r>
     </w:p>
     <w:bookmarkEnd w:id="16"/>
@@ -815,295 +870,7 @@
         <w:pStyle w:val="FirstParagraph"/>
       </w:pPr>
       <w:r>
-        <w:t xml:space="preserve">Pengujian dilakukan dengan tiga tujuan. Pertama, menguji kebenaran fungsional, yaitu memastikan ciphertext yang didekripsi kembali identik dengan plaintext awal. Kedua, menguji entropy untuk melihat apakah distribusi byte ciphertext lebih acak dibanding plaintext. Ketiga, menguji avalanche effect dengan mengubah satu bit pada plaintext dan menghitung persentase bit ciphertext yang berubah.</w:t>
-      </w:r>
-    </w:p>
-    <w:p>
-      <w:pPr>
-        <w:pStyle w:val="BodyText"/>
-      </w:pPr>
-      <w:r>
-        <w:t xml:space="preserve">Rumus entropy Shannon yang digunakan adalah:</w:t>
-      </w:r>
-    </w:p>
-    <w:p>
-      <w:pPr>
-        <w:pStyle w:val="SourceCode"/>
-      </w:pPr>
-      <w:r>
-        <w:rPr>
-          <w:rStyle w:val="VerbatimChar"/>
-        </w:rPr>
-        <w:t xml:space="preserve">H(X) = - Σ p(x) log2 p(x)</w:t>
-      </w:r>
-    </w:p>
-    <w:p>
-      <w:pPr>
-        <w:pStyle w:val="FirstParagraph"/>
-      </w:pPr>
-      <w:r>
-        <w:t xml:space="preserve">Jika ciphertext memiliki distribusi byte yang baik, nilai entropy akan bergerak mendekati 8 bit per byte. Untuk avalanche effect, nilai ideal secara konseptual mendekati 50%, karena perubahan kecil pada input seharusnya mengubah sekitar separuh bit output.</w:t>
-      </w:r>
-    </w:p>
-    <w:p>
-      <w:pPr>
-        <w:pStyle w:val="BodyText"/>
-      </w:pPr>
-      <w:r>
-        <w:t xml:space="preserve">Selain demo CLI, dibuat juga demo interaktif berbasis web. Demo ini menampilkan state 4x4 dari blok pertama, sehingga proses transformasi dapat diamati secara bertahap. Setiap langkah round dapat dilihat satu per satu melalui tombol</w:t>
-      </w:r>
-      <w:r>
-        <w:t xml:space="preserve"> </w:t>
-      </w:r>
-      <w:r>
-        <w:rPr>
-          <w:rStyle w:val="VerbatimChar"/>
-        </w:rPr>
-        <w:t xml:space="preserve">Prev</w:t>
-      </w:r>
-      <w:r>
-        <w:t xml:space="preserve">,</w:t>
-      </w:r>
-      <w:r>
-        <w:t xml:space="preserve"> </w:t>
-      </w:r>
-      <w:r>
-        <w:rPr>
-          <w:rStyle w:val="VerbatimChar"/>
-        </w:rPr>
-        <w:t xml:space="preserve">Next</w:t>
-      </w:r>
-      <w:r>
-        <w:t xml:space="preserve">, dan</w:t>
-      </w:r>
-      <w:r>
-        <w:t xml:space="preserve"> </w:t>
-      </w:r>
-      <w:r>
-        <w:rPr>
-          <w:rStyle w:val="VerbatimChar"/>
-        </w:rPr>
-        <w:t xml:space="preserve">Play</w:t>
-      </w:r>
-      <w:r>
-        <w:t xml:space="preserve">.</w:t>
-      </w:r>
-    </w:p>
-    <w:bookmarkEnd w:id="17"/>
-    <w:bookmarkStart w:id="18" w:name="hasil-implementasi-dan-sample-run"/>
-    <w:p>
-      <w:pPr>
-        <w:pStyle w:val="Heading2"/>
-      </w:pPr>
-      <w:r>
-        <w:t xml:space="preserve">6. Hasil Implementasi dan Sample Run</w:t>
-      </w:r>
-    </w:p>
-    <w:p>
-      <w:pPr>
-        <w:pStyle w:val="FirstParagraph"/>
-      </w:pPr>
-      <w:r>
-        <w:t xml:space="preserve">Implementasi dilakukan menggunakan Python. Demo menunjukkan bahwa plaintext berhasil dienkripsi menjadi ciphertext dalam format hex dan base64, kemudian didekripsi kembali menjadi plaintext awal. Hasil sample run menunjukkan:</w:t>
-      </w:r>
-    </w:p>
-    <w:p>
-      <w:pPr>
-        <w:pStyle w:val="Compact"/>
-        <w:numPr>
-          <w:ilvl w:val="0"/>
-          <w:numId w:val="1001"/>
-        </w:numPr>
-      </w:pPr>
-      <w:r>
-        <w:rPr>
-          <w:rStyle w:val="VerbatimChar"/>
-        </w:rPr>
-        <w:t xml:space="preserve">Decryption OK: True</w:t>
-      </w:r>
-    </w:p>
-    <w:p>
-      <w:pPr>
-        <w:pStyle w:val="Compact"/>
-        <w:numPr>
-          <w:ilvl w:val="0"/>
-          <w:numId w:val="1001"/>
-        </w:numPr>
-      </w:pPr>
-      <w:r>
-        <w:t xml:space="preserve">Entropy plaintext: sekitar 4.3846 bit/byte</w:t>
-      </w:r>
-    </w:p>
-    <w:p>
-      <w:pPr>
-        <w:pStyle w:val="Compact"/>
-        <w:numPr>
-          <w:ilvl w:val="0"/>
-          <w:numId w:val="1001"/>
-        </w:numPr>
-      </w:pPr>
-      <w:r>
-        <w:t xml:space="preserve">Entropy ciphertext: sekitar 6.6660 bit/byte</w:t>
-      </w:r>
-    </w:p>
-    <w:p>
-      <w:pPr>
-        <w:pStyle w:val="Compact"/>
-        <w:numPr>
-          <w:ilvl w:val="0"/>
-          <w:numId w:val="1001"/>
-        </w:numPr>
-      </w:pPr>
-      <w:r>
-        <w:t xml:space="preserve">Avalanche effect: sekitar 48.34%</w:t>
-      </w:r>
-    </w:p>
-    <w:p>
-      <w:pPr>
-        <w:pStyle w:val="FirstParagraph"/>
-      </w:pPr>
-      <w:r>
-        <w:t xml:space="preserve">Nilai avalanche effect tersebut menunjukkan bahwa perubahan satu bit pada plaintext menghasilkan perubahan besar pada ciphertext. Nilai ini mendekati karakteristik difusi yang diharapkan pada cipher modern, meskipun pengujian ini masih bersifat sederhana dan terbatas.</w:t>
-      </w:r>
-    </w:p>
-    <w:p>
-      <w:pPr>
-        <w:pStyle w:val="BodyText"/>
-      </w:pPr>
-      <w:r>
-        <w:t xml:space="preserve">Demo interaktif juga berhasil dijalankan. Pada halaman web, plaintext dan key dapat diubah, kemudian pengguna dapat menekan tombol</w:t>
-      </w:r>
-      <w:r>
-        <w:t xml:space="preserve"> </w:t>
-      </w:r>
-      <w:r>
-        <w:rPr>
-          <w:rStyle w:val="VerbatimChar"/>
-        </w:rPr>
-        <w:t xml:space="preserve">Encrypt &amp; Animate</w:t>
-      </w:r>
-      <w:r>
-        <w:t xml:space="preserve">. Sistem menampilkan ciphertext dalam bentuk hex dan status dekripsi. Jika algoritma berjalan benar, halaman menampilkan pesan bahwa plaintext kembali utuh.</w:t>
-      </w:r>
-    </w:p>
-    <w:bookmarkEnd w:id="18"/>
-    <w:bookmarkStart w:id="19" w:name="analisis-keamanan"/>
-    <w:p>
-      <w:pPr>
-        <w:pStyle w:val="Heading2"/>
-      </w:pPr>
-      <w:r>
-        <w:t xml:space="preserve">7. Analisis Keamanan</w:t>
-      </w:r>
-    </w:p>
-    <w:p>
-      <w:pPr>
-        <w:pStyle w:val="FirstParagraph"/>
-      </w:pPr>
-      <w:r>
-        <w:t xml:space="preserve">Analisis entropy menunjukkan bahwa ciphertext memiliki distribusi byte yang lebih acak dibanding plaintext. Plaintext berupa kalimat natural memiliki distribusi karakter yang cenderung berulang, sedangkan ciphertext menghasilkan byte yang lebih tersebar.</w:t>
-      </w:r>
-    </w:p>
-    <w:p>
-      <w:pPr>
-        <w:pStyle w:val="BodyText"/>
-      </w:pPr>
-      <w:r>
-        <w:t xml:space="preserve">Avalanche effect diuji dengan mengubah satu bit pertama pada plaintext dan membandingkan ciphertext sebelum dan sesudah perubahan. Hasil sekitar 48.34% menunjukkan bahwa hampir separuh bit ciphertext berubah. Ini merupakan indikator bahwa kombinasi S-Box dinamis, permutasi langkah kuda, rotasi bit, difusi byte, Feistel-like mixing, dan chaining berhasil menciptakan penyebaran perubahan yang cukup baik.</w:t>
-      </w:r>
-    </w:p>
-    <w:p>
-      <w:pPr>
-        <w:pStyle w:val="BodyText"/>
-      </w:pPr>
-      <w:r>
-        <w:t xml:space="preserve">Analisis frekuensi juga menunjukkan bahwa pola karakter plaintext tersamarkan pada ciphertext. Byte yang paling sering muncul pada ciphertext memiliki frekuensi rendah dan tersebar. Pengujian lanjutan dapat dikembangkan melalui differential cryptanalysis, linear cryptanalysis, uji randomness yang lebih besar, dan evaluasi terhadap skenario chosen-plaintext.</w:t>
-      </w:r>
-    </w:p>
-    <w:p>
-      <w:pPr>
-        <w:pStyle w:val="BodyText"/>
-      </w:pPr>
-      <w:r>
-        <w:t xml:space="preserve">Jika dibandingkan dengan cipher klasik seperti Caesar atau Vigenere, KCC-128 memiliki ruang transformasi yang lebih kompleks karena bekerja pada byte dan memakai beberapa lapisan round. Cipher klasik umumnya rentan terhadap analisis frekuensi karena hubungan antara plaintext dan ciphertext masih relatif langsung. Pada KCC-128, hubungan tersebut diputus melalui S-Box dinamis, permutasi langkah kuda, dan difusi antarbyte.</w:t>
-      </w:r>
-    </w:p>
-    <w:p>
-      <w:pPr>
-        <w:pStyle w:val="BodyText"/>
-      </w:pPr>
-      <w:r>
-        <w:t xml:space="preserve">KCC-128 mengambil inspirasi umum dari prinsip substitution-permutation network dan membangun komponen khas melalui S-Box chaotic serta permutasi berbasis mekanisme game. Kontribusi tugas ini terletak pada kreativitas arsitektur yang menggabungkan konsep catur, chaotic map, dan difusi invertibel.</w:t>
-      </w:r>
-    </w:p>
-    <w:bookmarkEnd w:id="19"/>
-    <w:bookmarkStart w:id="20" w:name="kelebihan-dan-keterbatasan"/>
-    <w:p>
-      <w:pPr>
-        <w:pStyle w:val="Heading2"/>
-      </w:pPr>
-      <w:r>
-        <w:t xml:space="preserve">8. Kelebihan dan Keterbatasan</w:t>
-      </w:r>
-    </w:p>
-    <w:p>
-      <w:pPr>
-        <w:pStyle w:val="FirstParagraph"/>
-      </w:pPr>
-      <w:r>
-        <w:t xml:space="preserve">Kelebihan KCC-128 adalah adanya modifikasi nyata pada komponen inti cipher. Algoritma ini menggabungkan mekanisme game dan konsep matematika non-konvensional dalam satu arsitektur. S-Box tidak tetap, permutasi tidak linear, dan key schedule memengaruhi struktur transformasi.</w:t>
-      </w:r>
-    </w:p>
-    <w:p>
-      <w:pPr>
-        <w:pStyle w:val="BodyText"/>
-      </w:pPr>
-      <w:r>
-        <w:t xml:space="preserve">Pengembangan berikutnya dapat diarahkan pada pengujian statistik yang lebih luas, variasi IV acak, dan perbandingan hasil avalanche pada dataset plaintext yang lebih besar. Penggunaan SHA-256 dalam key schedule membantu determinisme dan distribusi seed, sementara struktur round memberi ruang eksplorasi untuk optimasi lanjutan.</w:t>
-      </w:r>
-    </w:p>
-    <w:p>
-      <w:pPr>
-        <w:pStyle w:val="BodyText"/>
-      </w:pPr>
-      <w:r>
-        <w:t xml:space="preserve">Pengujian saat ini menggunakan sampel demonstrasi. Nilai entropy dan avalanche effect dapat diperluas dengan ukuran data uji yang lebih besar. Mode IV pada implementasi ini diturunkan secara deterministik dari kunci untuk konsistensi demo; pengembangan berikutnya dapat memakai IV acak yang disimpan bersama ciphertext.</w:t>
-      </w:r>
-    </w:p>
-    <w:bookmarkEnd w:id="20"/>
-    <w:bookmarkStart w:id="21" w:name="kesimpulan"/>
-    <w:p>
-      <w:pPr>
-        <w:pStyle w:val="Heading2"/>
-      </w:pPr>
-      <w:r>
-        <w:t xml:space="preserve">9. Kesimpulan</w:t>
-      </w:r>
-    </w:p>
-    <w:p>
-      <w:pPr>
-        <w:pStyle w:val="FirstParagraph"/>
-      </w:pPr>
-      <w:r>
-        <w:t xml:space="preserve">Knight-Chaos Cipher berhasil dirancang sebagai algoritma kriptografi yang memodifikasi arsitektur cipher pada level substitusi, permutasi, difusi, dan key schedule. Integrasi langkah kuda catur memberikan pola permutasi berbasis game, sedangkan logistic chaotic map menghasilkan S-Box dinamis berbasis konsep matematika. Implementasi Python menunjukkan bahwa enkripsi dan dekripsi berjalan benar, serta analisis awal menunjukkan entropy ciphertext meningkat dan avalanche effect cukup kuat.</w:t>
-      </w:r>
-    </w:p>
-    <w:p>
-      <w:pPr>
-        <w:pStyle w:val="BodyText"/>
-      </w:pPr>
-      <w:r>
-        <w:t xml:space="preserve">KCC-128 memenuhi tujuan tugas untuk merancang algoritma kriptografi baru yang kreatif, dapat diimplementasikan, dapat didemonstrasikan, dan dapat dianalisis melalui entropy, avalanche effect, serta frekuensi byte.</w:t>
-      </w:r>
-    </w:p>
-    <w:bookmarkEnd w:id="21"/>
-    <w:bookmarkStart w:id="22" w:name="referensi"/>
-    <w:p>
-      <w:pPr>
-        <w:pStyle w:val="Heading2"/>
-      </w:pPr>
-      <w:r>
-        <w:t xml:space="preserve">Referensi</w:t>
+        <w:t xml:space="preserve">Pengujian dilakukan untuk tiga hal:</w:t>
       </w:r>
     </w:p>
     <w:p>
@@ -1115,20 +882,17 @@
         </w:numPr>
       </w:pPr>
       <w:r>
-        <w:t xml:space="preserve">William Stallings,</w:t>
-      </w:r>
-      <w:r>
-        <w:t xml:space="preserve"> </w:t>
-      </w:r>
-      <w:r>
-        <w:rPr>
-          <w:i/>
-          <w:iCs/>
-        </w:rPr>
-        <w:t xml:space="preserve">Cryptography and Network Security: Principles and Practice</w:t>
-      </w:r>
-      <w:r>
-        <w:t xml:space="preserve">.</w:t>
+        <w:rPr>
+          <w:b/>
+          <w:bCs/>
+        </w:rPr>
+        <w:t xml:space="preserve">Correctness</w:t>
+      </w:r>
+      <w:r>
+        <w:t xml:space="preserve"> </w:t>
+      </w:r>
+      <w:r>
+        <w:t xml:space="preserve">— apakah decrypt(encrypt(plaintext)) == plaintext?</w:t>
       </w:r>
     </w:p>
     <w:p>
@@ -1140,20 +904,17 @@
         </w:numPr>
       </w:pPr>
       <w:r>
-        <w:t xml:space="preserve">Joan Daemen dan Vincent Rijmen,</w:t>
-      </w:r>
-      <w:r>
-        <w:t xml:space="preserve"> </w:t>
-      </w:r>
-      <w:r>
-        <w:rPr>
-          <w:i/>
-          <w:iCs/>
-        </w:rPr>
-        <w:t xml:space="preserve">The Design of Rijndael: AES - The Advanced Encryption Standard</w:t>
-      </w:r>
-      <w:r>
-        <w:t xml:space="preserve">.</w:t>
+        <w:rPr>
+          <w:b/>
+          <w:bCs/>
+        </w:rPr>
+        <w:t xml:space="preserve">Entropy</w:t>
+      </w:r>
+      <w:r>
+        <w:t xml:space="preserve"> </w:t>
+      </w:r>
+      <w:r>
+        <w:t xml:space="preserve">— apakah byte distribution ciphertext lebih uniform dibanding plaintext?</w:t>
       </w:r>
     </w:p>
     <w:p>
@@ -1165,20 +926,70 @@
         </w:numPr>
       </w:pPr>
       <w:r>
-        <w:t xml:space="preserve">Bruce Schneier,</w:t>
-      </w:r>
-      <w:r>
-        <w:t xml:space="preserve"> </w:t>
-      </w:r>
-      <w:r>
-        <w:rPr>
-          <w:i/>
-          <w:iCs/>
-        </w:rPr>
-        <w:t xml:space="preserve">Applied Cryptography</w:t>
-      </w:r>
-      <w:r>
-        <w:t xml:space="preserve">.</w:t>
+        <w:rPr>
+          <w:b/>
+          <w:bCs/>
+        </w:rPr>
+        <w:t xml:space="preserve">Avalanche effect</w:t>
+      </w:r>
+      <w:r>
+        <w:t xml:space="preserve"> </w:t>
+      </w:r>
+      <w:r>
+        <w:t xml:space="preserve">— kalau 1 bit plaintext diubah, berapa persen bit ciphertext yang ikut berubah?</w:t>
+      </w:r>
+    </w:p>
+    <w:p>
+      <w:pPr>
+        <w:pStyle w:val="FirstParagraph"/>
+      </w:pPr>
+      <w:r>
+        <w:t xml:space="preserve">Rumus Shannon entropy:</w:t>
+      </w:r>
+    </w:p>
+    <w:p>
+      <w:pPr>
+        <w:pStyle w:val="SourceCode"/>
+      </w:pPr>
+      <w:r>
+        <w:rPr>
+          <w:rStyle w:val="VerbatimChar"/>
+        </w:rPr>
+        <w:t xml:space="preserve">H(X) = - Σ p(x) log2 p(x)</w:t>
+      </w:r>
+    </w:p>
+    <w:p>
+      <w:pPr>
+        <w:pStyle w:val="FirstParagraph"/>
+      </w:pPr>
+      <w:r>
+        <w:t xml:space="preserve">Maximum entropy adalah 8 bit/byte (perfectly uniform distribution). Untuk avalanche effect, idealnya sekitar 50% — artinya perubahan kecil pada input mengubah kira-kira setengah bit output.</w:t>
+      </w:r>
+    </w:p>
+    <w:p>
+      <w:pPr>
+        <w:pStyle w:val="BodyText"/>
+      </w:pPr>
+      <w:r>
+        <w:t xml:space="preserve">Selain demo CLI (Python), dibuat juga demo interaktif berbasis web yang menampilkan matrix 4×4 dan perubahan state per step.</w:t>
+      </w:r>
+    </w:p>
+    <w:bookmarkEnd w:id="17"/>
+    <w:bookmarkStart w:id="18" w:name="hasil-implementasi-dan-sample-run"/>
+    <w:p>
+      <w:pPr>
+        <w:pStyle w:val="Heading2"/>
+      </w:pPr>
+      <w:r>
+        <w:t xml:space="preserve">6. Hasil Implementasi dan Sample Run</w:t>
+      </w:r>
+    </w:p>
+    <w:p>
+      <w:pPr>
+        <w:pStyle w:val="FirstParagraph"/>
+      </w:pPr>
+      <w:r>
+        <w:t xml:space="preserve">Implementasi menggunakan Python. Hasil sample run:</w:t>
       </w:r>
     </w:p>
     <w:p>
@@ -1186,7 +997,394 @@
         <w:pStyle w:val="Compact"/>
         <w:numPr>
           <w:ilvl w:val="0"/>
-          <w:numId w:val="1002"/>
+          <w:numId w:val="1003"/>
+        </w:numPr>
+      </w:pPr>
+      <w:r>
+        <w:rPr>
+          <w:b/>
+          <w:bCs/>
+        </w:rPr>
+        <w:t xml:space="preserve">Decryption OK:</w:t>
+      </w:r>
+      <w:r>
+        <w:t xml:space="preserve"> </w:t>
+      </w:r>
+      <w:r>
+        <w:t xml:space="preserve">True (plaintext kembali utuh)</w:t>
+      </w:r>
+    </w:p>
+    <w:p>
+      <w:pPr>
+        <w:pStyle w:val="Compact"/>
+        <w:numPr>
+          <w:ilvl w:val="0"/>
+          <w:numId w:val="1003"/>
+        </w:numPr>
+      </w:pPr>
+      <w:r>
+        <w:rPr>
+          <w:b/>
+          <w:bCs/>
+        </w:rPr>
+        <w:t xml:space="preserve">Plaintext entropy:</w:t>
+      </w:r>
+      <w:r>
+        <w:t xml:space="preserve"> </w:t>
+      </w:r>
+      <w:r>
+        <w:t xml:space="preserve">~4.38 bit/byte</w:t>
+      </w:r>
+    </w:p>
+    <w:p>
+      <w:pPr>
+        <w:pStyle w:val="Compact"/>
+        <w:numPr>
+          <w:ilvl w:val="0"/>
+          <w:numId w:val="1003"/>
+        </w:numPr>
+      </w:pPr>
+      <w:r>
+        <w:rPr>
+          <w:b/>
+          <w:bCs/>
+        </w:rPr>
+        <w:t xml:space="preserve">Ciphertext entropy:</w:t>
+      </w:r>
+      <w:r>
+        <w:t xml:space="preserve"> </w:t>
+      </w:r>
+      <w:r>
+        <w:t xml:space="preserve">~6.63 bit/byte</w:t>
+      </w:r>
+    </w:p>
+    <w:p>
+      <w:pPr>
+        <w:pStyle w:val="Compact"/>
+        <w:numPr>
+          <w:ilvl w:val="0"/>
+          <w:numId w:val="1003"/>
+        </w:numPr>
+      </w:pPr>
+      <w:r>
+        <w:rPr>
+          <w:b/>
+          <w:bCs/>
+        </w:rPr>
+        <w:t xml:space="preserve">Avalanche effect:</w:t>
+      </w:r>
+      <w:r>
+        <w:t xml:space="preserve"> </w:t>
+      </w:r>
+      <w:r>
+        <w:t xml:space="preserve">~48.34%</w:t>
+      </w:r>
+    </w:p>
+    <w:p>
+      <w:pPr>
+        <w:pStyle w:val="FirstParagraph"/>
+      </w:pPr>
+      <w:r>
+        <w:t xml:space="preserve">Entropy naik dari 4.38 ke 6.63, menunjukkan ciphertext punya byte distribution yang lebih uniform dibanding plaintext (yang berupa teks biasa dengan karakter berulang). Avalanche 48.34% artinya mengubah 1 bit pada plaintext menyebabkan hampir separuh bit ciphertext berubah.</w:t>
+      </w:r>
+    </w:p>
+    <w:p>
+      <w:pPr>
+        <w:pStyle w:val="BodyText"/>
+      </w:pPr>
+      <w:r>
+        <w:t xml:space="preserve">Demo interaktif web juga berjalan. User bisa memasukkan plaintext dan key, menekan tombol Encrypt, lalu melihat perubahan state round per round.</w:t>
+      </w:r>
+    </w:p>
+    <w:bookmarkEnd w:id="18"/>
+    <w:bookmarkStart w:id="19" w:name="analisis-keamanan"/>
+    <w:p>
+      <w:pPr>
+        <w:pStyle w:val="Heading2"/>
+      </w:pPr>
+      <w:r>
+        <w:t xml:space="preserve">7. Analisis Keamanan</w:t>
+      </w:r>
+    </w:p>
+    <w:p>
+      <w:pPr>
+        <w:pStyle w:val="FirstParagraph"/>
+      </w:pPr>
+      <w:r>
+        <w:rPr>
+          <w:b/>
+          <w:bCs/>
+        </w:rPr>
+        <w:t xml:space="preserve">Entropy:</w:t>
+      </w:r>
+      <w:r>
+        <w:t xml:space="preserve"> </w:t>
+      </w:r>
+      <w:r>
+        <w:t xml:space="preserve">Ciphertext menunjukkan byte distribution yang lebih uniform dibanding plaintext. Pattern karakter yang berulang pada teks natural sudah tidak terlihat pada ciphertext.</w:t>
+      </w:r>
+    </w:p>
+    <w:p>
+      <w:pPr>
+        <w:pStyle w:val="BodyText"/>
+      </w:pPr>
+      <w:r>
+        <w:rPr>
+          <w:b/>
+          <w:bCs/>
+        </w:rPr>
+        <w:t xml:space="preserve">Avalanche effect:</w:t>
+      </w:r>
+      <w:r>
+        <w:t xml:space="preserve"> </w:t>
+      </w:r>
+      <w:r>
+        <w:t xml:space="preserve">Dengan mengubah 1 bit pertama pada plaintext, sekitar 48% bit ciphertext berubah. Ini menunjukkan bahwa kombinasi dynamic S-Box, knight permutation, rotation, diffusion, dan Feistel mixing bekerja cukup baik dalam men-propagate perubahan.</w:t>
+      </w:r>
+    </w:p>
+    <w:p>
+      <w:pPr>
+        <w:pStyle w:val="BodyText"/>
+      </w:pPr>
+      <w:r>
+        <w:rPr>
+          <w:b/>
+          <w:bCs/>
+        </w:rPr>
+        <w:t xml:space="preserve">Frequency analysis:</w:t>
+      </w:r>
+      <w:r>
+        <w:t xml:space="preserve"> </w:t>
+      </w:r>
+      <w:r>
+        <w:t xml:space="preserve">Byte yang paling sering muncul pada ciphertext punya frekuensi rendah dan tersebar — tidak ada dominasi satu value tertentu.</w:t>
+      </w:r>
+    </w:p>
+    <w:p>
+      <w:pPr>
+        <w:pStyle w:val="BodyText"/>
+      </w:pPr>
+      <w:r>
+        <w:rPr>
+          <w:b/>
+          <w:bCs/>
+        </w:rPr>
+        <w:t xml:space="preserve">Perbandingan dengan cipher klasik:</w:t>
+      </w:r>
+      <w:r>
+        <w:t xml:space="preserve"> </w:t>
+      </w:r>
+      <w:r>
+        <w:t xml:space="preserve">Caesar dan Vigenere rentan terhadap frequency analysis karena hubungan plaintext–ciphertext masih langsung (substitution per karakter/posisi). KCC-128 memutus hubungan ini melalui non-linear S-Box, permutation yang men-shuffle posisi, dan diffusion yang men-propagate perubahan antar byte.</w:t>
+      </w:r>
+    </w:p>
+    <w:p>
+      <w:pPr>
+        <w:pStyle w:val="BodyText"/>
+      </w:pPr>
+      <w:r>
+        <w:t xml:space="preserve">Pengujian lanjutan yang bisa dilakukan: differential cryptanalysis, linear cryptanalysis, randomness test dengan dataset besar, dan evaluasi terhadap chosen-plaintext attack.</w:t>
+      </w:r>
+    </w:p>
+    <w:bookmarkEnd w:id="19"/>
+    <w:bookmarkStart w:id="20" w:name="kelebihan-dan-keterbatasan"/>
+    <w:p>
+      <w:pPr>
+        <w:pStyle w:val="Heading2"/>
+      </w:pPr>
+      <w:r>
+        <w:t xml:space="preserve">8. Kelebihan dan Keterbatasan</w:t>
+      </w:r>
+    </w:p>
+    <w:p>
+      <w:pPr>
+        <w:pStyle w:val="FirstParagraph"/>
+      </w:pPr>
+      <w:r>
+        <w:rPr>
+          <w:b/>
+          <w:bCs/>
+        </w:rPr>
+        <w:t xml:space="preserve">Kelebihan:</w:t>
+      </w:r>
+      <w:r>
+        <w:t xml:space="preserve"> </w:t>
+      </w:r>
+      <w:r>
+        <w:t xml:space="preserve">- S-Box tidak tetap, berubah setiap round berdasarkan chaotic map</w:t>
+      </w:r>
+      <w:r>
+        <w:t xml:space="preserve"> </w:t>
+      </w:r>
+      <w:r>
+        <w:t xml:space="preserve">- Non-linear permutation dari knight’s tour pattern</w:t>
+      </w:r>
+      <w:r>
+        <w:t xml:space="preserve"> </w:t>
+      </w:r>
+      <w:r>
+        <w:t xml:space="preserve">- Key schedule memengaruhi semua komponen (bukan hanya round key)</w:t>
+      </w:r>
+      <w:r>
+        <w:t xml:space="preserve"> </w:t>
+      </w:r>
+      <w:r>
+        <w:t xml:space="preserve">- Semua operation invertible sehingga decryption bekerja dengan benar</w:t>
+      </w:r>
+    </w:p>
+    <w:p>
+      <w:pPr>
+        <w:pStyle w:val="BodyText"/>
+      </w:pPr>
+      <w:r>
+        <w:rPr>
+          <w:b/>
+          <w:bCs/>
+        </w:rPr>
+        <w:t xml:space="preserve">Keterbatasan:</w:t>
+      </w:r>
+      <w:r>
+        <w:t xml:space="preserve"> </w:t>
+      </w:r>
+      <w:r>
+        <w:t xml:space="preserve">- IV di-derive secara deterministic dari key (untuk konsistensi demo). Idealnya IV random dan disimpan bersama ciphertext</w:t>
+      </w:r>
+      <w:r>
+        <w:t xml:space="preserve"> </w:t>
+      </w:r>
+      <w:r>
+        <w:t xml:space="preserve">- Pengujian masih menggunakan sample kecil. Test dengan data lebih besar bisa memberi gambaran yang lebih akurat</w:t>
+      </w:r>
+      <w:r>
+        <w:t xml:space="preserve"> </w:t>
+      </w:r>
+      <w:r>
+        <w:t xml:space="preserve">- Belum ada mekanisme authentication (MAC/HMAC). Cipher hanya menjamin confidentiality, belum integrity</w:t>
+      </w:r>
+      <w:r>
+        <w:t xml:space="preserve"> </w:t>
+      </w:r>
+      <w:r>
+        <w:t xml:space="preserve">- Kualitas kriptografis S-Box (nonlinearity, differential uniformity) belum diuji secara formal</w:t>
+      </w:r>
+    </w:p>
+    <w:bookmarkEnd w:id="20"/>
+    <w:bookmarkStart w:id="21" w:name="kesimpulan"/>
+    <w:p>
+      <w:pPr>
+        <w:pStyle w:val="Heading2"/>
+      </w:pPr>
+      <w:r>
+        <w:t xml:space="preserve">9. Kesimpulan</w:t>
+      </w:r>
+    </w:p>
+    <w:p>
+      <w:pPr>
+        <w:pStyle w:val="FirstParagraph"/>
+      </w:pPr>
+      <w:r>
+        <w:t xml:space="preserve">Knight-Chaos Cipher (KCC-128) berhasil dirancang dan diimplementasikan sebagai block cipher yang memodifikasi komponen substitution, permutation, diffusion, dan key schedule. Knight’s tour dipakai sebagai mekanisme permutation, dan logistic chaotic map dipakai untuk men-generate dynamic S-Box per round.</w:t>
+      </w:r>
+    </w:p>
+    <w:p>
+      <w:pPr>
+        <w:pStyle w:val="BodyText"/>
+      </w:pPr>
+      <w:r>
+        <w:t xml:space="preserve">Dari pengujian awal, encryption-decryption berjalan benar, ciphertext entropy meningkat signifikan, dan avalanche effect mendekati 50%.</w:t>
+      </w:r>
+    </w:p>
+    <w:bookmarkEnd w:id="21"/>
+    <w:bookmarkStart w:id="22" w:name="referensi"/>
+    <w:p>
+      <w:pPr>
+        <w:pStyle w:val="Heading2"/>
+      </w:pPr>
+      <w:r>
+        <w:t xml:space="preserve">Referensi</w:t>
+      </w:r>
+    </w:p>
+    <w:p>
+      <w:pPr>
+        <w:pStyle w:val="Compact"/>
+        <w:numPr>
+          <w:ilvl w:val="0"/>
+          <w:numId w:val="1004"/>
+        </w:numPr>
+      </w:pPr>
+      <w:r>
+        <w:t xml:space="preserve">William Stallings,</w:t>
+      </w:r>
+      <w:r>
+        <w:t xml:space="preserve"> </w:t>
+      </w:r>
+      <w:r>
+        <w:rPr>
+          <w:i/>
+          <w:iCs/>
+        </w:rPr>
+        <w:t xml:space="preserve">Cryptography and Network Security: Principles and Practice</w:t>
+      </w:r>
+      <w:r>
+        <w:t xml:space="preserve">.</w:t>
+      </w:r>
+    </w:p>
+    <w:p>
+      <w:pPr>
+        <w:pStyle w:val="Compact"/>
+        <w:numPr>
+          <w:ilvl w:val="0"/>
+          <w:numId w:val="1004"/>
+        </w:numPr>
+      </w:pPr>
+      <w:r>
+        <w:t xml:space="preserve">Joan Daemen dan Vincent Rijmen,</w:t>
+      </w:r>
+      <w:r>
+        <w:t xml:space="preserve"> </w:t>
+      </w:r>
+      <w:r>
+        <w:rPr>
+          <w:i/>
+          <w:iCs/>
+        </w:rPr>
+        <w:t xml:space="preserve">The Design of Rijndael: AES - The Advanced Encryption Standard</w:t>
+      </w:r>
+      <w:r>
+        <w:t xml:space="preserve">.</w:t>
+      </w:r>
+    </w:p>
+    <w:p>
+      <w:pPr>
+        <w:pStyle w:val="Compact"/>
+        <w:numPr>
+          <w:ilvl w:val="0"/>
+          <w:numId w:val="1004"/>
+        </w:numPr>
+      </w:pPr>
+      <w:r>
+        <w:t xml:space="preserve">Bruce Schneier,</w:t>
+      </w:r>
+      <w:r>
+        <w:t xml:space="preserve"> </w:t>
+      </w:r>
+      <w:r>
+        <w:rPr>
+          <w:i/>
+          <w:iCs/>
+        </w:rPr>
+        <w:t xml:space="preserve">Applied Cryptography</w:t>
+      </w:r>
+      <w:r>
+        <w:t xml:space="preserve">.</w:t>
+      </w:r>
+    </w:p>
+    <w:p>
+      <w:pPr>
+        <w:pStyle w:val="Compact"/>
+        <w:numPr>
+          <w:ilvl w:val="0"/>
+          <w:numId w:val="1004"/>
         </w:numPr>
       </w:pPr>
       <w:r>
@@ -1318,6 +1516,91 @@
       </w:pPr>
     </w:lvl>
   </w:abstractNum>
+  <w:abstractNum w:abstractNumId="99411">
+    <w:nsid w:val="00A99411"/>
+    <w:multiLevelType w:val="multilevel"/>
+    <w:lvl w:ilvl="0">
+      <w:start w:val="1"/>
+      <w:numFmt w:val="decimal"/>
+      <w:lvlText w:val="%1."/>
+      <w:lvlJc w:val="left"/>
+      <w:pPr>
+        <w:ind w:left="720" w:hanging="360"/>
+      </w:pPr>
+    </w:lvl>
+    <w:lvl w:ilvl="1">
+      <w:start w:val="1"/>
+      <w:numFmt w:val="decimal"/>
+      <w:lvlText w:val="%2."/>
+      <w:lvlJc w:val="left"/>
+      <w:pPr>
+        <w:ind w:left="1440" w:hanging="360"/>
+      </w:pPr>
+    </w:lvl>
+    <w:lvl w:ilvl="2">
+      <w:start w:val="1"/>
+      <w:numFmt w:val="decimal"/>
+      <w:lvlText w:val="%3."/>
+      <w:lvlJc w:val="left"/>
+      <w:pPr>
+        <w:ind w:left="2160" w:hanging="360"/>
+      </w:pPr>
+    </w:lvl>
+    <w:lvl w:ilvl="3">
+      <w:start w:val="1"/>
+      <w:numFmt w:val="decimal"/>
+      <w:lvlText w:val="%4."/>
+      <w:lvlJc w:val="left"/>
+      <w:pPr>
+        <w:ind w:left="2880" w:hanging="360"/>
+      </w:pPr>
+    </w:lvl>
+    <w:lvl w:ilvl="4">
+      <w:start w:val="1"/>
+      <w:numFmt w:val="decimal"/>
+      <w:lvlText w:val="%5."/>
+      <w:lvlJc w:val="left"/>
+      <w:pPr>
+        <w:ind w:left="3600" w:hanging="360"/>
+      </w:pPr>
+    </w:lvl>
+    <w:lvl w:ilvl="5">
+      <w:start w:val="1"/>
+      <w:numFmt w:val="decimal"/>
+      <w:lvlText w:val="%6."/>
+      <w:lvlJc w:val="left"/>
+      <w:pPr>
+        <w:ind w:left="4320" w:hanging="360"/>
+      </w:pPr>
+    </w:lvl>
+    <w:lvl w:ilvl="6">
+      <w:start w:val="1"/>
+      <w:numFmt w:val="decimal"/>
+      <w:lvlText w:val="%7."/>
+      <w:lvlJc w:val="left"/>
+      <w:pPr>
+        <w:ind w:left="5040" w:hanging="360"/>
+      </w:pPr>
+    </w:lvl>
+    <w:lvl w:ilvl="7">
+      <w:start w:val="1"/>
+      <w:numFmt w:val="decimal"/>
+      <w:lvlText w:val="%8."/>
+      <w:lvlJc w:val="left"/>
+      <w:pPr>
+        <w:ind w:left="5760" w:hanging="360"/>
+      </w:pPr>
+    </w:lvl>
+    <w:lvl w:ilvl="8">
+      <w:start w:val="1"/>
+      <w:numFmt w:val="decimal"/>
+      <w:lvlText w:val="%9."/>
+      <w:lvlJc w:val="left"/>
+      <w:pPr>
+        <w:ind w:left="6480" w:hanging="360"/>
+      </w:pPr>
+    </w:lvl>
+  </w:abstractNum>
   <w:abstractNum w:abstractNumId="991">
     <w:nsid w:val="0000A991"/>
     <w:multiLevelType w:val="multilevel"/>
@@ -1421,98 +1704,73 @@
       </w:rPr>
     </w:lvl>
   </w:abstractNum>
-  <w:abstractNum w:abstractNumId="99411">
-    <w:nsid w:val="00A99411"/>
-    <w:multiLevelType w:val="multilevel"/>
-    <w:lvl w:ilvl="0">
-      <w:start w:val="1"/>
-      <w:numFmt w:val="decimal"/>
-      <w:lvlText w:val="%1."/>
-      <w:lvlJc w:val="left"/>
-      <w:pPr>
-        <w:ind w:left="720" w:hanging="360"/>
-      </w:pPr>
-    </w:lvl>
-    <w:lvl w:ilvl="1">
-      <w:start w:val="1"/>
-      <w:numFmt w:val="decimal"/>
-      <w:lvlText w:val="%2."/>
-      <w:lvlJc w:val="left"/>
-      <w:pPr>
-        <w:ind w:left="1440" w:hanging="360"/>
-      </w:pPr>
-    </w:lvl>
-    <w:lvl w:ilvl="2">
-      <w:start w:val="1"/>
-      <w:numFmt w:val="decimal"/>
-      <w:lvlText w:val="%3."/>
-      <w:lvlJc w:val="left"/>
-      <w:pPr>
-        <w:ind w:left="2160" w:hanging="360"/>
-      </w:pPr>
-    </w:lvl>
-    <w:lvl w:ilvl="3">
-      <w:start w:val="1"/>
-      <w:numFmt w:val="decimal"/>
-      <w:lvlText w:val="%4."/>
-      <w:lvlJc w:val="left"/>
-      <w:pPr>
-        <w:ind w:left="2880" w:hanging="360"/>
-      </w:pPr>
-    </w:lvl>
-    <w:lvl w:ilvl="4">
-      <w:start w:val="1"/>
-      <w:numFmt w:val="decimal"/>
-      <w:lvlText w:val="%5."/>
-      <w:lvlJc w:val="left"/>
-      <w:pPr>
-        <w:ind w:left="3600" w:hanging="360"/>
-      </w:pPr>
-    </w:lvl>
-    <w:lvl w:ilvl="5">
-      <w:start w:val="1"/>
-      <w:numFmt w:val="decimal"/>
-      <w:lvlText w:val="%6."/>
-      <w:lvlJc w:val="left"/>
-      <w:pPr>
-        <w:ind w:left="4320" w:hanging="360"/>
-      </w:pPr>
-    </w:lvl>
-    <w:lvl w:ilvl="6">
-      <w:start w:val="1"/>
-      <w:numFmt w:val="decimal"/>
-      <w:lvlText w:val="%7."/>
-      <w:lvlJc w:val="left"/>
-      <w:pPr>
-        <w:ind w:left="5040" w:hanging="360"/>
-      </w:pPr>
-    </w:lvl>
-    <w:lvl w:ilvl="7">
-      <w:start w:val="1"/>
-      <w:numFmt w:val="decimal"/>
-      <w:lvlText w:val="%8."/>
-      <w:lvlJc w:val="left"/>
-      <w:pPr>
-        <w:ind w:left="5760" w:hanging="360"/>
-      </w:pPr>
-    </w:lvl>
-    <w:lvl w:ilvl="8">
-      <w:start w:val="1"/>
-      <w:numFmt w:val="decimal"/>
-      <w:lvlText w:val="%9."/>
-      <w:lvlJc w:val="left"/>
-      <w:pPr>
-        <w:ind w:left="6480" w:hanging="360"/>
-      </w:pPr>
-    </w:lvl>
-  </w:abstractNum>
   <w:num w:numId="1000">
     <w:abstractNumId w:val="990"/>
   </w:num>
   <w:num w:numId="1001">
+    <w:abstractNumId w:val="99411"/>
+    <w:lvlOverride w:ilvl="0">
+      <w:startOverride w:val="1"/>
+    </w:lvlOverride>
+    <w:lvlOverride w:ilvl="1">
+      <w:startOverride w:val="1"/>
+    </w:lvlOverride>
+    <w:lvlOverride w:ilvl="2">
+      <w:startOverride w:val="1"/>
+    </w:lvlOverride>
+    <w:lvlOverride w:ilvl="3">
+      <w:startOverride w:val="1"/>
+    </w:lvlOverride>
+    <w:lvlOverride w:ilvl="4">
+      <w:startOverride w:val="1"/>
+    </w:lvlOverride>
+    <w:lvlOverride w:ilvl="5">
+      <w:startOverride w:val="1"/>
+    </w:lvlOverride>
+    <w:lvlOverride w:ilvl="6">
+      <w:startOverride w:val="1"/>
+    </w:lvlOverride>
+    <w:lvlOverride w:ilvl="7">
+      <w:startOverride w:val="1"/>
+    </w:lvlOverride>
+    <w:lvlOverride w:ilvl="8">
+      <w:startOverride w:val="1"/>
+    </w:lvlOverride>
+  </w:num>
+  <w:num w:numId="1002">
+    <w:abstractNumId w:val="99411"/>
+    <w:lvlOverride w:ilvl="0">
+      <w:startOverride w:val="1"/>
+    </w:lvlOverride>
+    <w:lvlOverride w:ilvl="1">
+      <w:startOverride w:val="1"/>
+    </w:lvlOverride>
+    <w:lvlOverride w:ilvl="2">
+      <w:startOverride w:val="1"/>
+    </w:lvlOverride>
+    <w:lvlOverride w:ilvl="3">
+      <w:startOverride w:val="1"/>
+    </w:lvlOverride>
+    <w:lvlOverride w:ilvl="4">
+      <w:startOverride w:val="1"/>
+    </w:lvlOverride>
+    <w:lvlOverride w:ilvl="5">
+      <w:startOverride w:val="1"/>
+    </w:lvlOverride>
+    <w:lvlOverride w:ilvl="6">
+      <w:startOverride w:val="1"/>
+    </w:lvlOverride>
+    <w:lvlOverride w:ilvl="7">
+      <w:startOverride w:val="1"/>
+    </w:lvlOverride>
+    <w:lvlOverride w:ilvl="8">
+      <w:startOverride w:val="1"/>
+    </w:lvlOverride>
+  </w:num>
+  <w:num w:numId="1003">
     <w:abstractNumId w:val="991"/>
   </w:num>
-  <w:num w:numId="1002">
+  <w:num w:numId="1004">
     <w:abstractNumId w:val="99411"/>
     <w:lvlOverride w:ilvl="0">
       <w:startOverride w:val="1"/>

</xml_diff>

<commit_message>
Update report wording and regenerate artifacts
</commit_message>
<xml_diff>
--- a/docs/makalah-knight-chaos-cipher.docx
+++ b/docs/makalah-knight-chaos-cipher.docx
@@ -1088,14 +1088,6 @@
         <w:t xml:space="preserve">Entropy naik dari 4.38 ke 6.63, menunjukkan ciphertext punya byte distribution yang lebih uniform dibanding plaintext (yang berupa teks biasa dengan karakter berulang). Avalanche 48.34% artinya mengubah 1 bit pada plaintext menyebabkan hampir separuh bit ciphertext berubah.</w:t>
       </w:r>
     </w:p>
-    <w:p>
-      <w:pPr>
-        <w:pStyle w:val="BodyText"/>
-      </w:pPr>
-      <w:r>
-        <w:t xml:space="preserve">Demo interaktif web juga berjalan. User bisa memasukkan plaintext dan key, menekan tombol Encrypt, lalu melihat perubahan state round per round.</w:t>
-      </w:r>
-    </w:p>
     <w:bookmarkEnd w:id="18"/>
     <w:bookmarkStart w:id="19" w:name="analisis-keamanan"/>
     <w:p>
@@ -1283,7 +1275,7 @@
         <w:pStyle w:val="FirstParagraph"/>
       </w:pPr>
       <w:r>
-        <w:t xml:space="preserve">Knight-Chaos Cipher (KCC-128) berhasil dirancang dan diimplementasikan sebagai block cipher yang memodifikasi komponen substitution, permutation, diffusion, dan key schedule. Knight’s tour dipakai sebagai mekanisme permutation, dan logistic chaotic map dipakai untuk men-generate dynamic S-Box per round.</w:t>
+        <w:t xml:space="preserve">Knight-Chaos Cipher (KCC-128) dirancang dan diimplementasikan sebagai block cipher yang memodifikasi komponen substitution, permutation, diffusion, dan key schedule. Knight’s tour digunakan sebagai mekanisme permutation, dan logistic chaotic map digunakan untuk men-generate dynamic S-Box per round.</w:t>
       </w:r>
     </w:p>
     <w:p>

</xml_diff>